<commit_message>
Remove references list from presentation speaker script
The script is spoken delivery notes; the citation list belongs in the
final report, not at the end of the speaking script.
</commit_message>
<xml_diff>
--- a/Deliverable4_Presentation_Script.docx
+++ b/Deliverable4_Presentation_Script.docx
@@ -572,243 +572,6 @@
         <w:t>To conclude: the project delivered a principled design, a correct and fully tested proof of concept, and an optimization pass that improved every measured operation and reduced memory while an identical test contract guaranteed unchanged behavior. The central lesson is the interplay between theory and measurement. Asymptotic analysis chose the structures and predicted where they would fail, and both predictions held. But measurement got the final vote three times: a generator erased an algorithmic win until it was inlined, a cache was destroyed by scans until they bypassed it, and a textbook-inferior sorted array beat a skip list because its inner loop runs in C. Theory chooses the structure; measurement validates the choice; and the test contract is what lets you act on the measurements safely. All code, tests, benchmarks, and this presentation are on GitHub at the link shown. Thank you, and I am happy to take questions.</w:t>
       </w:r>
     </w:p>
-    <w:p>
-      <w:r>
-        <w:br w:type="page"/>
-      </w:r>
-    </w:p>
-    <w:p>
-      <w:pPr>
-        <w:spacing w:line="480" w:lineRule="auto" w:after="0" w:before="0"/>
-        <w:jc w:val="center"/>
-      </w:pPr>
-      <w:r>
-        <w:rPr>
-          <w:rFonts w:ascii="Times New Roman" w:hAnsi="Times New Roman"/>
-          <w:b/>
-          <w:i w:val="0"/>
-          <w:color w:val="000000"/>
-          <w:sz w:val="24"/>
-        </w:rPr>
-        <w:t>References</w:t>
-      </w:r>
-    </w:p>
-    <w:p>
-      <w:pPr>
-        <w:spacing w:line="480" w:lineRule="auto" w:after="0"/>
-        <w:ind w:left="720" w:hanging="720"/>
-      </w:pPr>
-      <w:r>
-        <w:rPr>
-          <w:rFonts w:ascii="Times New Roman" w:hAnsi="Times New Roman"/>
-          <w:b w:val="0"/>
-          <w:i w:val="0"/>
-          <w:color w:val="000000"/>
-          <w:sz w:val="24"/>
-        </w:rPr>
-        <w:t xml:space="preserve">Cormen, T. H., Leiserson, C. E., Rivest, R. L., &amp; Stein, C. (2022). </w:t>
-      </w:r>
-      <w:r>
-        <w:rPr>
-          <w:rFonts w:ascii="Times New Roman" w:hAnsi="Times New Roman"/>
-          <w:b w:val="0"/>
-          <w:i/>
-          <w:color w:val="000000"/>
-          <w:sz w:val="24"/>
-        </w:rPr>
-        <w:t>Introduction to algorithms</w:t>
-      </w:r>
-      <w:r>
-        <w:rPr>
-          <w:rFonts w:ascii="Times New Roman" w:hAnsi="Times New Roman"/>
-          <w:b w:val="0"/>
-          <w:i w:val="0"/>
-          <w:color w:val="000000"/>
-          <w:sz w:val="24"/>
-        </w:rPr>
-        <w:t xml:space="preserve"> (4th ed.). MIT Press.</w:t>
-      </w:r>
-    </w:p>
-    <w:p>
-      <w:pPr>
-        <w:spacing w:line="480" w:lineRule="auto" w:after="0"/>
-        <w:ind w:left="720" w:hanging="720"/>
-      </w:pPr>
-      <w:r>
-        <w:rPr>
-          <w:rFonts w:ascii="Times New Roman" w:hAnsi="Times New Roman"/>
-          <w:b w:val="0"/>
-          <w:i w:val="0"/>
-          <w:color w:val="000000"/>
-          <w:sz w:val="24"/>
-        </w:rPr>
-        <w:t xml:space="preserve">Fredman, M. L., &amp; Tarjan, R. E. (1987). Fibonacci heaps and their uses in improved network optimization algorithms. </w:t>
-      </w:r>
-      <w:r>
-        <w:rPr>
-          <w:rFonts w:ascii="Times New Roman" w:hAnsi="Times New Roman"/>
-          <w:b w:val="0"/>
-          <w:i/>
-          <w:color w:val="000000"/>
-          <w:sz w:val="24"/>
-        </w:rPr>
-        <w:t>Journal of the ACM, 34</w:t>
-      </w:r>
-      <w:r>
-        <w:rPr>
-          <w:rFonts w:ascii="Times New Roman" w:hAnsi="Times New Roman"/>
-          <w:b w:val="0"/>
-          <w:i w:val="0"/>
-          <w:color w:val="000000"/>
-          <w:sz w:val="24"/>
-        </w:rPr>
-        <w:t>(3), 596–615. https://doi.org/10.1145/28869.28874</w:t>
-      </w:r>
-    </w:p>
-    <w:p>
-      <w:pPr>
-        <w:spacing w:line="480" w:lineRule="auto" w:after="0"/>
-        <w:ind w:left="720" w:hanging="720"/>
-      </w:pPr>
-      <w:r>
-        <w:rPr>
-          <w:rFonts w:ascii="Times New Roman" w:hAnsi="Times New Roman"/>
-          <w:b w:val="0"/>
-          <w:i w:val="0"/>
-          <w:color w:val="000000"/>
-          <w:sz w:val="24"/>
-        </w:rPr>
-        <w:t xml:space="preserve">Goodrich, M. T., Tamassia, R., &amp; Goldwasser, M. H. (2013). </w:t>
-      </w:r>
-      <w:r>
-        <w:rPr>
-          <w:rFonts w:ascii="Times New Roman" w:hAnsi="Times New Roman"/>
-          <w:b w:val="0"/>
-          <w:i/>
-          <w:color w:val="000000"/>
-          <w:sz w:val="24"/>
-        </w:rPr>
-        <w:t>Data structures and algorithms in Python</w:t>
-      </w:r>
-      <w:r>
-        <w:rPr>
-          <w:rFonts w:ascii="Times New Roman" w:hAnsi="Times New Roman"/>
-          <w:b w:val="0"/>
-          <w:i w:val="0"/>
-          <w:color w:val="000000"/>
-          <w:sz w:val="24"/>
-        </w:rPr>
-        <w:t>. Wiley.</w:t>
-      </w:r>
-    </w:p>
-    <w:p>
-      <w:pPr>
-        <w:spacing w:line="480" w:lineRule="auto" w:after="0"/>
-        <w:ind w:left="720" w:hanging="720"/>
-      </w:pPr>
-      <w:r>
-        <w:rPr>
-          <w:rFonts w:ascii="Times New Roman" w:hAnsi="Times New Roman"/>
-          <w:b w:val="0"/>
-          <w:i w:val="0"/>
-          <w:color w:val="000000"/>
-          <w:sz w:val="24"/>
-        </w:rPr>
-        <w:t xml:space="preserve">O'Neil, P., Cheng, E., Gawlick, D., &amp; O'Neil, E. (1996). The log-structured merge-tree (LSM-tree). </w:t>
-      </w:r>
-      <w:r>
-        <w:rPr>
-          <w:rFonts w:ascii="Times New Roman" w:hAnsi="Times New Roman"/>
-          <w:b w:val="0"/>
-          <w:i/>
-          <w:color w:val="000000"/>
-          <w:sz w:val="24"/>
-        </w:rPr>
-        <w:t>Acta Informatica, 33</w:t>
-      </w:r>
-      <w:r>
-        <w:rPr>
-          <w:rFonts w:ascii="Times New Roman" w:hAnsi="Times New Roman"/>
-          <w:b w:val="0"/>
-          <w:i w:val="0"/>
-          <w:color w:val="000000"/>
-          <w:sz w:val="24"/>
-        </w:rPr>
-        <w:t>(4), 351–385. https://doi.org/10.1007/s002360050048</w:t>
-      </w:r>
-    </w:p>
-    <w:p>
-      <w:pPr>
-        <w:spacing w:line="480" w:lineRule="auto" w:after="0"/>
-        <w:ind w:left="720" w:hanging="720"/>
-      </w:pPr>
-      <w:r>
-        <w:rPr>
-          <w:rFonts w:ascii="Times New Roman" w:hAnsi="Times New Roman"/>
-          <w:b w:val="0"/>
-          <w:i w:val="0"/>
-          <w:color w:val="000000"/>
-          <w:sz w:val="24"/>
-        </w:rPr>
-        <w:t xml:space="preserve">Pagh, R., &amp; Rodler, F. F. (2004). Cuckoo hashing. </w:t>
-      </w:r>
-      <w:r>
-        <w:rPr>
-          <w:rFonts w:ascii="Times New Roman" w:hAnsi="Times New Roman"/>
-          <w:b w:val="0"/>
-          <w:i/>
-          <w:color w:val="000000"/>
-          <w:sz w:val="24"/>
-        </w:rPr>
-        <w:t>Journal of Algorithms, 51</w:t>
-      </w:r>
-      <w:r>
-        <w:rPr>
-          <w:rFonts w:ascii="Times New Roman" w:hAnsi="Times New Roman"/>
-          <w:b w:val="0"/>
-          <w:i w:val="0"/>
-          <w:color w:val="000000"/>
-          <w:sz w:val="24"/>
-        </w:rPr>
-        <w:t>(2), 122–144. https://doi.org/10.1016/j.jalgor.2003.12.002</w:t>
-      </w:r>
-    </w:p>
-    <w:p>
-      <w:pPr>
-        <w:spacing w:line="480" w:lineRule="auto" w:after="0"/>
-        <w:ind w:left="720" w:hanging="720"/>
-      </w:pPr>
-      <w:r>
-        <w:rPr>
-          <w:rFonts w:ascii="Times New Roman" w:hAnsi="Times New Roman"/>
-          <w:b w:val="0"/>
-          <w:i w:val="0"/>
-          <w:color w:val="000000"/>
-          <w:sz w:val="24"/>
-        </w:rPr>
-        <w:t xml:space="preserve">Pugh, W. (1990). Skip lists: A probabilistic alternative to balanced trees. </w:t>
-      </w:r>
-      <w:r>
-        <w:rPr>
-          <w:rFonts w:ascii="Times New Roman" w:hAnsi="Times New Roman"/>
-          <w:b w:val="0"/>
-          <w:i/>
-          <w:color w:val="000000"/>
-          <w:sz w:val="24"/>
-        </w:rPr>
-        <w:t>Communications of the ACM, 33</w:t>
-      </w:r>
-      <w:r>
-        <w:rPr>
-          <w:rFonts w:ascii="Times New Roman" w:hAnsi="Times New Roman"/>
-          <w:b w:val="0"/>
-          <w:i w:val="0"/>
-          <w:color w:val="000000"/>
-          <w:sz w:val="24"/>
-        </w:rPr>
-        <w:t>(6), 668–676. https://doi.org/10.1145/78973.78977</w:t>
-      </w:r>
-    </w:p>
     <w:sectPr>
       <w:headerReference w:type="default" r:id="rId9"/>
       <w:pgSz w:w="12240" w:h="15840"/>

</xml_diff>

<commit_message>
Redesign presentation layout and rebalance slide timings
Slides were bare text boxes: no bullet glyphs, content stranded in the
top half of a 4:3 canvas, and ASCII arrows. Rebuilt the layout on a
16:9 grid with a shared content band, real bullet characters with
hanging indents, a title accent rule, and a footer carrying the slide
number.

- Title slide: navy spine, accent rule, metadata block, URL band
- Results slide is now a three-column table, headline gains emphasised
- Chart slides balance a text column against a larger, centred figure
- Per-slide time budgets now track spoken word count (~127 wpm) and
  still sum to exactly 15:00
- Limitations slide no longer breaks one sentence across indent levels
</commit_message>
<xml_diff>
--- a/Deliverable4_Presentation_Script.docx
+++ b/Deliverable4_Presentation_Script.docx
@@ -181,7 +181,7 @@
           <w:color w:val="000000"/>
           <w:sz w:val="24"/>
         </w:rPr>
-        <w:t>Slide 1 (0:45) - Developing and Optimizing Data Structures for a Dynamic Inventory Management System in Python</w:t>
+        <w:t>Slide 1 (0:55) - Developing and Optimizing Data Structures for a Dynamic Inventory Management System in Python</w:t>
       </w:r>
     </w:p>
     <w:p>
@@ -212,7 +212,7 @@
           <w:color w:val="000000"/>
           <w:sz w:val="24"/>
         </w:rPr>
-        <w:t>Slide 2 (1:15) - The Problem: Dynamic Inventory</w:t>
+        <w:t>Slide 2 (1:10) - The Problem: Dynamic Inventory</w:t>
       </w:r>
     </w:p>
     <w:p>
@@ -243,7 +243,7 @@
           <w:color w:val="000000"/>
           <w:sz w:val="24"/>
         </w:rPr>
-        <w:t>Slide 3 (1:30) - Design: One Structure per Query Pattern</w:t>
+        <w:t>Slide 3 (1:25) - Design: One Structure per Query Pattern</w:t>
       </w:r>
     </w:p>
     <w:p>
@@ -274,7 +274,7 @@
           <w:color w:val="000000"/>
           <w:sz w:val="24"/>
         </w:rPr>
-        <w:t>Slide 4 (1:10) - Phase 2: Proof of Concept</w:t>
+        <w:t>Slide 4 (1:05) - Phase 2: Proof of Concept</w:t>
       </w:r>
     </w:p>
     <w:p>
@@ -336,7 +336,7 @@
           <w:color w:val="000000"/>
           <w:sz w:val="24"/>
         </w:rPr>
-        <w:t>Slide 6 (0:55) - Measured Bottlenecks in the Baseline</w:t>
+        <w:t>Slide 6 (1:05) - Measured Bottlenecks in the Baseline</w:t>
       </w:r>
     </w:p>
     <w:p>
@@ -367,7 +367,7 @@
           <w:color w:val="000000"/>
           <w:sz w:val="24"/>
         </w:rPr>
-        <w:t>Slide 7 (1:40) - Phase 3: Optimizations</w:t>
+        <w:t>Slide 7 (1:25) - Phase 3: Optimizations</w:t>
       </w:r>
     </w:p>
     <w:p>
@@ -398,7 +398,7 @@
           <w:color w:val="000000"/>
           <w:sz w:val="24"/>
         </w:rPr>
-        <w:t>Slide 8 (1:25) - Two Instructive Failures</w:t>
+        <w:t>Slide 8 (1:20) - Two Instructive Failures</w:t>
       </w:r>
     </w:p>
     <w:p>
@@ -429,7 +429,7 @@
           <w:color w:val="000000"/>
           <w:sz w:val="24"/>
         </w:rPr>
-        <w:t>Slide 9 (1:25) - Results: Speedup vs Baseline (100k products)</w:t>
+        <w:t>Slide 9 (1:20) - Results: Speedup vs Baseline (100k products)</w:t>
       </w:r>
     </w:p>
     <w:p>
@@ -491,7 +491,7 @@
           <w:color w:val="000000"/>
           <w:sz w:val="24"/>
         </w:rPr>
-        <w:t>Slide 11 (0:45) - Same Story for Low-Stock Alerts</w:t>
+        <w:t>Slide 11 (0:50) - Same Story for Low-Stock Alerts</w:t>
       </w:r>
     </w:p>
     <w:p>
@@ -522,7 +522,7 @@
           <w:color w:val="000000"/>
           <w:sz w:val="24"/>
         </w:rPr>
-        <w:t>Slide 12 (1:05) - Limitations and Future Work</w:t>
+        <w:t>Slide 12 (1:10) - Limitations and Future Work</w:t>
       </w:r>
     </w:p>
     <w:p>
@@ -553,7 +553,7 @@
           <w:color w:val="000000"/>
           <w:sz w:val="24"/>
         </w:rPr>
-        <w:t>Slide 13 (1:00) - Conclusion</w:t>
+        <w:t>Slide 13 (1:10) - Conclusion</w:t>
       </w:r>
     </w:p>
     <w:p>

</xml_diff>